<commit_message>
POO S7 (Polimorfismo y sobreescritura): profundizacion rigurosa (dynamic dispatch, casting)
</commit_message>
<xml_diff>
--- a/07-week/optional-activity/pdf/Actividad-Semana07.docx
+++ b/07-week/optional-activity/pdf/Actividad-Semana07.docx
@@ -430,7 +430,7 @@
           <w:sz w:val="22"/>
           <w:szCs w:val="22"/>
         </w:rPr>
-        <w:t xml:space="preserve">Sobrescribir un método en varias subclases.</w:t>
+        <w:t xml:space="preserve">Sobrescribir un método en varias subclases con @Override.</w:t>
       </w:r>
     </w:p>
     <w:p>
@@ -454,7 +454,7 @@
           <w:sz w:val="22"/>
           <w:szCs w:val="22"/>
         </w:rPr>
-        <w:t xml:space="preserve">Usar referencias de superclase de forma polimórfica.</w:t>
+        <w:t xml:space="preserve">Procesar objetos distintos de forma uniforme (polimorfismo).</w:t>
       </w:r>
     </w:p>
     <w:p>
@@ -478,7 +478,7 @@
           <w:sz w:val="22"/>
           <w:szCs w:val="22"/>
         </w:rPr>
-        <w:t xml:space="preserve">Recorrer una colección heterogénea con un mismo bucle.</w:t>
+        <w:t xml:space="preserve">Aplicar instanceof + downcasting con seguridad.</w:t>
       </w:r>
     </w:p>
     <w:p>
@@ -539,7 +539,7 @@
           <w:sz w:val="22"/>
           <w:szCs w:val="22"/>
         </w:rPr>
-        <w:t xml:space="preserve"> con un método </w:t>
+        <w:t xml:space="preserve"> con </w:t>
       </w:r>
       <w:r>
         <w:rPr>
@@ -557,7 +557,25 @@
           <w:sz w:val="22"/>
           <w:szCs w:val="22"/>
         </w:rPr>
-        <w:t xml:space="preserve"> que devuelva 0.</w:t>
+        <w:t xml:space="preserve"> (puede ser abstracta) y </w:t>
+      </w:r>
+      <w:r>
+        <w:rPr>
+          <w:rFonts w:ascii="Consolas" w:hAnsi="Consolas" w:cs="Consolas"/>
+          <w:color w:val="000000"/>
+          <w:sz w:val="22"/>
+          <w:szCs w:val="22"/>
+        </w:rPr>
+        <w:t xml:space="preserve">nombre()</w:t>
+      </w:r>
+      <w:r>
+        <w:rPr>
+          <w:rFonts w:ascii="Times New Roman" w:hAnsi="Times New Roman" w:cs="Times New Roman"/>
+          <w:color w:val="000000"/>
+          <w:sz w:val="22"/>
+          <w:szCs w:val="22"/>
+        </w:rPr>
+        <w:t xml:space="preserve">.</w:t>
       </w:r>
     </w:p>
     <w:p>
@@ -581,7 +599,7 @@
           <w:sz w:val="22"/>
           <w:szCs w:val="22"/>
         </w:rPr>
-        <w:t xml:space="preserve">Crea subclases </w:t>
+        <w:t xml:space="preserve">Crea </w:t>
       </w:r>
       <w:r>
         <w:rPr>
@@ -664,6 +682,24 @@
           <w:szCs w:val="22"/>
         </w:rPr>
         <w:t xml:space="preserve">area()</w:t>
+      </w:r>
+      <w:r>
+        <w:rPr>
+          <w:rFonts w:ascii="Times New Roman" w:hAnsi="Times New Roman" w:cs="Times New Roman"/>
+          <w:color w:val="000000"/>
+          <w:sz w:val="22"/>
+          <w:szCs w:val="22"/>
+        </w:rPr>
+        <w:t xml:space="preserve"> con </w:t>
+      </w:r>
+      <w:r>
+        <w:rPr>
+          <w:rFonts w:ascii="Consolas" w:hAnsi="Consolas" w:cs="Consolas"/>
+          <w:color w:val="000000"/>
+          <w:sz w:val="22"/>
+          <w:szCs w:val="22"/>
+        </w:rPr>
+        <w:t xml:space="preserve">@Override</w:t>
       </w:r>
       <w:r>
         <w:rPr>
@@ -738,7 +774,166 @@
           <w:sz w:val="22"/>
           <w:szCs w:val="22"/>
         </w:rPr>
-        <w:t xml:space="preserve">Recorre el arreglo con un solo bucle e imprime el área de cada figura (polimorfismo).</w:t>
+        <w:t xml:space="preserve">Recorre el arreglo con </w:t>
+      </w:r>
+      <w:r>
+        <w:rPr>
+          <w:rFonts w:ascii="Times New Roman" w:hAnsi="Times New Roman" w:cs="Times New Roman"/>
+          <w:b/>
+          <w:color w:val="000000"/>
+          <w:sz w:val="22"/>
+          <w:szCs w:val="22"/>
+        </w:rPr>
+        <w:t xml:space="preserve">un solo bucle</w:t>
+      </w:r>
+      <w:r>
+        <w:rPr>
+          <w:rFonts w:ascii="Times New Roman" w:hAnsi="Times New Roman" w:cs="Times New Roman"/>
+          <w:color w:val="000000"/>
+          <w:sz w:val="22"/>
+          <w:szCs w:val="22"/>
+        </w:rPr>
+        <w:t xml:space="preserve"> e imprime nombre + área de cada figura (evidencia el enlace dinámico).</w:t>
+      </w:r>
+    </w:p>
+    <w:p>
+      <w:pPr>
+        <w:spacing w:after="120" w:line="276" w:lineRule="auto"/>
+        <w:ind w:left="454" w:hanging="284"/>
+      </w:pPr>
+      <w:r>
+        <w:rPr>
+          <w:rFonts w:ascii="Times New Roman" w:hAnsi="Times New Roman" w:cs="Times New Roman"/>
+          <w:color w:val="000000"/>
+          <w:sz w:val="22"/>
+          <w:szCs w:val="22"/>
+        </w:rPr>
+        <w:t xml:space="preserve">5.	</w:t>
+      </w:r>
+      <w:r>
+        <w:rPr>
+          <w:rFonts w:ascii="Times New Roman" w:hAnsi="Times New Roman" w:cs="Times New Roman"/>
+          <w:color w:val="000000"/>
+          <w:sz w:val="22"/>
+          <w:szCs w:val="22"/>
+        </w:rPr>
+        <w:t xml:space="preserve">Usa </w:t>
+      </w:r>
+      <w:r>
+        <w:rPr>
+          <w:rFonts w:ascii="Consolas" w:hAnsi="Consolas" w:cs="Consolas"/>
+          <w:color w:val="000000"/>
+          <w:sz w:val="22"/>
+          <w:szCs w:val="22"/>
+        </w:rPr>
+        <w:t xml:space="preserve">instanceof</w:t>
+      </w:r>
+      <w:r>
+        <w:rPr>
+          <w:rFonts w:ascii="Times New Roman" w:hAnsi="Times New Roman" w:cs="Times New Roman"/>
+          <w:color w:val="000000"/>
+          <w:sz w:val="22"/>
+          <w:szCs w:val="22"/>
+        </w:rPr>
+        <w:t xml:space="preserve"> para, solo en los </w:t>
+      </w:r>
+      <w:r>
+        <w:rPr>
+          <w:rFonts w:ascii="Consolas" w:hAnsi="Consolas" w:cs="Consolas"/>
+          <w:color w:val="000000"/>
+          <w:sz w:val="22"/>
+          <w:szCs w:val="22"/>
+        </w:rPr>
+        <w:t xml:space="preserve">Circulo</w:t>
+      </w:r>
+      <w:r>
+        <w:rPr>
+          <w:rFonts w:ascii="Times New Roman" w:hAnsi="Times New Roman" w:cs="Times New Roman"/>
+          <w:color w:val="000000"/>
+          <w:sz w:val="22"/>
+          <w:szCs w:val="22"/>
+        </w:rPr>
+        <w:t xml:space="preserve">, invocar un método </w:t>
+      </w:r>
+      <w:r>
+        <w:rPr>
+          <w:rFonts w:ascii="Times New Roman" w:hAnsi="Times New Roman" w:cs="Times New Roman"/>
+          <w:b/>
+          <w:color w:val="000000"/>
+          <w:sz w:val="22"/>
+          <w:szCs w:val="22"/>
+        </w:rPr>
+        <w:t xml:space="preserve">propio</w:t>
+      </w:r>
+      <w:r>
+        <w:rPr>
+          <w:rFonts w:ascii="Times New Roman" w:hAnsi="Times New Roman" w:cs="Times New Roman"/>
+          <w:color w:val="000000"/>
+          <w:sz w:val="22"/>
+          <w:szCs w:val="22"/>
+        </w:rPr>
+        <w:t xml:space="preserve"> (ej. </w:t>
+      </w:r>
+      <w:r>
+        <w:rPr>
+          <w:rFonts w:ascii="Consolas" w:hAnsi="Consolas" w:cs="Consolas"/>
+          <w:color w:val="000000"/>
+          <w:sz w:val="22"/>
+          <w:szCs w:val="22"/>
+        </w:rPr>
+        <w:t xml:space="preserve">diametro()</w:t>
+      </w:r>
+      <w:r>
+        <w:rPr>
+          <w:rFonts w:ascii="Times New Roman" w:hAnsi="Times New Roman" w:cs="Times New Roman"/>
+          <w:color w:val="000000"/>
+          <w:sz w:val="22"/>
+          <w:szCs w:val="22"/>
+        </w:rPr>
+        <w:t xml:space="preserve">), con downcasting seguro.</w:t>
+      </w:r>
+    </w:p>
+    <w:p>
+      <w:pPr>
+        <w:spacing w:after="120" w:line="276" w:lineRule="auto"/>
+        <w:ind w:left="454" w:hanging="284"/>
+      </w:pPr>
+      <w:r>
+        <w:rPr>
+          <w:rFonts w:ascii="Times New Roman" w:hAnsi="Times New Roman" w:cs="Times New Roman"/>
+          <w:color w:val="000000"/>
+          <w:sz w:val="22"/>
+          <w:szCs w:val="22"/>
+        </w:rPr>
+        <w:t xml:space="preserve">6.	</w:t>
+      </w:r>
+      <w:r>
+        <w:rPr>
+          <w:rFonts w:ascii="Times New Roman" w:hAnsi="Times New Roman" w:cs="Times New Roman"/>
+          <w:color w:val="000000"/>
+          <w:sz w:val="22"/>
+          <w:szCs w:val="22"/>
+        </w:rPr>
+        <w:t xml:space="preserve">Demuestra "abierto a extensión": agrega una 4ª figura y muestra que el bucle </w:t>
+      </w:r>
+      <w:r>
+        <w:rPr>
+          <w:rFonts w:ascii="Times New Roman" w:hAnsi="Times New Roman" w:cs="Times New Roman"/>
+          <w:b/>
+          <w:color w:val="000000"/>
+          <w:sz w:val="22"/>
+          <w:szCs w:val="22"/>
+        </w:rPr>
+        <w:t xml:space="preserve">no cambia</w:t>
+      </w:r>
+      <w:r>
+        <w:rPr>
+          <w:rFonts w:ascii="Times New Roman" w:hAnsi="Times New Roman" w:cs="Times New Roman"/>
+          <w:color w:val="000000"/>
+          <w:sz w:val="22"/>
+          <w:szCs w:val="22"/>
+        </w:rPr>
+        <w:t xml:space="preserve">.</w:t>
       </w:r>
     </w:p>
     <w:p>
@@ -832,7 +1027,7 @@
           <w:sz w:val="22"/>
           <w:szCs w:val="22"/>
         </w:rPr>
-        <w:t xml:space="preserve"> con distintas subclases.</w:t>
+        <w:t xml:space="preserve"> con distintas subclases y bucle único polimórfico.</w:t>
       </w:r>
     </w:p>
     <w:p>
@@ -851,12 +1046,45 @@
       </w:r>
       <w:r>
         <w:rPr>
-          <w:rFonts w:ascii="Times New Roman" w:hAnsi="Times New Roman" w:cs="Times New Roman"/>
-          <w:color w:val="000000"/>
-          <w:sz w:val="22"/>
-          <w:szCs w:val="22"/>
-        </w:rPr>
-        <w:t xml:space="preserve">Un único bucle que use polimorfismo.</w:t>
+          <w:rFonts w:ascii="Consolas" w:hAnsi="Consolas" w:cs="Consolas"/>
+          <w:color w:val="000000"/>
+          <w:sz w:val="22"/>
+          <w:szCs w:val="22"/>
+        </w:rPr>
+        <w:t xml:space="preserve">instanceof</w:t>
+      </w:r>
+      <w:r>
+        <w:rPr>
+          <w:rFonts w:ascii="Times New Roman" w:hAnsi="Times New Roman" w:cs="Times New Roman"/>
+          <w:color w:val="000000"/>
+          <w:sz w:val="22"/>
+          <w:szCs w:val="22"/>
+        </w:rPr>
+        <w:t xml:space="preserve"> + downcasting correctos.</w:t>
+      </w:r>
+    </w:p>
+    <w:p>
+      <w:pPr>
+        <w:spacing w:after="120" w:line="276" w:lineRule="auto"/>
+        <w:ind w:left="454" w:hanging="284"/>
+      </w:pPr>
+      <w:r>
+        <w:rPr>
+          <w:rFonts w:ascii="Times New Roman" w:hAnsi="Times New Roman" w:cs="Times New Roman"/>
+          <w:color w:val="000000"/>
+          <w:sz w:val="22"/>
+          <w:szCs w:val="22"/>
+        </w:rPr>
+        <w:t xml:space="preserve">•	</w:t>
+      </w:r>
+      <w:r>
+        <w:rPr>
+          <w:rFonts w:ascii="Times New Roman" w:hAnsi="Times New Roman" w:cs="Times New Roman"/>
+          <w:color w:val="000000"/>
+          <w:sz w:val="22"/>
+          <w:szCs w:val="22"/>
+        </w:rPr>
+        <w:t xml:space="preserve">Evidencia de extensibilidad (4ª figura sin tocar el bucle).</w:t>
       </w:r>
     </w:p>
     <w:p>
@@ -959,7 +1187,7 @@
           <w:sz w:val="18"/>
           <w:szCs w:val="18"/>
         </w:rPr>
-        <w:t xml:space="preserve">  README.md   -&gt; salida de ejemplo (areas)</w:t>
+        <w:t xml:space="preserve">  README.md   -&gt; salida (nombre/area) + explicacion del enlace dinamico</w:t>
       </w:r>
     </w:p>
     <w:p>
@@ -999,7 +1227,7 @@
           <w:sz w:val="22"/>
           <w:szCs w:val="22"/>
         </w:rPr>
-        <w:t xml:space="preserve">Crea el repo público con ese nombre.</w:t>
+        <w:t xml:space="preserve">Crea el repositorio público con ese nombre.</w:t>
       </w:r>
     </w:p>
     <w:p>
@@ -1047,7 +1275,7 @@
           <w:sz w:val="22"/>
           <w:szCs w:val="22"/>
         </w:rPr>
-        <w:t xml:space="preserve">Comparte el enlace por el canal indicado.</w:t>
+        <w:t xml:space="preserve">Comparte el enlace por el canal indicado por el docente.</w:t>
       </w:r>
     </w:p>
     <w:p>
@@ -1130,7 +1358,7 @@
                 <w:sz w:val="20"/>
                 <w:szCs w:val="20"/>
               </w:rPr>
-              <w:t xml:space="preserve">Excelente</w:t>
+              <w:t xml:space="preserve">Excelente (100%)</w:t>
             </w:r>
           </w:p>
         </w:tc>
@@ -1152,7 +1380,7 @@
                 <w:sz w:val="20"/>
                 <w:szCs w:val="20"/>
               </w:rPr>
-              <w:t xml:space="preserve">Aceptable</w:t>
+              <w:t xml:space="preserve">Aceptable (60%)</w:t>
             </w:r>
           </w:p>
         </w:tc>
@@ -1174,7 +1402,7 @@
                 <w:sz w:val="20"/>
                 <w:szCs w:val="20"/>
               </w:rPr>
-              <w:t xml:space="preserve">Por mejorar</w:t>
+              <w:t xml:space="preserve">Por mejorar (0%)</w:t>
             </w:r>
           </w:p>
         </w:tc>
@@ -1238,7 +1466,7 @@
                 <w:sz w:val="20"/>
                 <w:szCs w:val="20"/>
               </w:rPr>
-              <w:t xml:space="preserve">En las 3 subclases</w:t>
+              <w:t xml:space="preserve">En las 3 (4) subclases</w:t>
             </w:r>
           </w:p>
         </w:tc>
@@ -1298,7 +1526,7 @@
                 <w:sz w:val="20"/>
                 <w:szCs w:val="20"/>
               </w:rPr>
-              <w:t xml:space="preserve">35</w:t>
+              <w:t xml:space="preserve">30</w:t>
             </w:r>
           </w:p>
         </w:tc>
@@ -1320,7 +1548,7 @@
                 <w:sz w:val="20"/>
                 <w:szCs w:val="20"/>
               </w:rPr>
-              <w:t xml:space="preserve">Arreglo polimórfico</w:t>
+              <w:t xml:space="preserve">Bucle único polimórfico</w:t>
             </w:r>
           </w:p>
         </w:tc>
@@ -1340,7 +1568,7 @@
                 <w:sz w:val="20"/>
                 <w:szCs w:val="20"/>
               </w:rPr>
-              <w:t xml:space="preserve">Correcto</w:t>
+              <w:t xml:space="preserve">Correcto y claro</w:t>
             </w:r>
           </w:p>
         </w:tc>
@@ -1422,7 +1650,7 @@
                 <w:sz w:val="20"/>
                 <w:szCs w:val="20"/>
               </w:rPr>
-              <w:t xml:space="preserve">Bucle único con polimorfismo</w:t>
+              <w:t xml:space="preserve">instanceof + downcasting</w:t>
             </w:r>
           </w:p>
         </w:tc>
@@ -1442,7 +1670,7 @@
                 <w:sz w:val="20"/>
                 <w:szCs w:val="20"/>
               </w:rPr>
-              <w:t xml:space="preserve">Correcto</w:t>
+              <w:t xml:space="preserve">Correcto y seguro</w:t>
             </w:r>
           </w:p>
         </w:tc>
@@ -1482,7 +1710,7 @@
                 <w:sz w:val="20"/>
                 <w:szCs w:val="20"/>
               </w:rPr>
-              <w:t xml:space="preserve">Ausente</w:t>
+              <w:t xml:space="preserve">Ausente/erróneo</w:t>
             </w:r>
           </w:p>
         </w:tc>
@@ -1524,7 +1752,7 @@
                 <w:sz w:val="20"/>
                 <w:szCs w:val="20"/>
               </w:rPr>
-              <w:t xml:space="preserve">README y repositorio</w:t>
+              <w:t xml:space="preserve">Extensibilidad (4ª figura) + README</w:t>
             </w:r>
           </w:p>
         </w:tc>
@@ -1544,7 +1772,7 @@
                 <w:sz w:val="20"/>
                 <w:szCs w:val="20"/>
               </w:rPr>
-              <w:t xml:space="preserve">Ordenado</w:t>
+              <w:t xml:space="preserve">Demostrada y explicada</w:t>
             </w:r>
           </w:p>
         </w:tc>
@@ -1564,7 +1792,7 @@
                 <w:sz w:val="20"/>
                 <w:szCs w:val="20"/>
               </w:rPr>
-              <w:t xml:space="preserve">Aceptable</w:t>
+              <w:t xml:space="preserve">Parcial</w:t>
             </w:r>
           </w:p>
         </w:tc>
@@ -1584,7 +1812,7 @@
                 <w:sz w:val="20"/>
                 <w:szCs w:val="20"/>
               </w:rPr>
-              <w:t xml:space="preserve">Deficiente</w:t>
+              <w:t xml:space="preserve">Ausente</w:t>
             </w:r>
           </w:p>
         </w:tc>
@@ -1604,7 +1832,7 @@
                 <w:sz w:val="20"/>
                 <w:szCs w:val="20"/>
               </w:rPr>
-              <w:t xml:space="preserve">15</w:t>
+              <w:t xml:space="preserve">20</w:t>
             </w:r>
           </w:p>
         </w:tc>
@@ -1623,7 +1851,7 @@
           <w:sz w:val="21"/>
           <w:szCs w:val="21"/>
         </w:rPr>
-        <w:t xml:space="preserve">Nota: actividad formativa y opcional (sin nota en Moodle). La guía unificada de entrega estará en el Manual de Entrega de Actividades Opcionales (próximamente).</w:t>
+        <w:t xml:space="preserve">Nota: actividad formativa y opcional (sin nota en Moodle). La guía unificada para entregar todas las actividades opcionales, válida para todas las materias, estará en el Manual de Entrega de Actividades Opcionales (próximamente).</w:t>
       </w:r>
     </w:p>
     <w:sectPr>

</xml_diff>